<commit_message>
add retriever hybrid in engine
</commit_message>
<xml_diff>
--- a/docs/tổng quan kiến trúc hệ thống.docx
+++ b/docs/tổng quan kiến trúc hệ thống.docx
@@ -252,7 +252,7 @@
         <w:t>Task 1.1:</w:t>
       </w:r>
       <w:r>
-        <w:t xml:space="preserve"> Setup .env (Gemini, LangSmith, SQL URL, Redis/Postgres URL).Nhiệm vụ 1.1: Thiết lập .env (Gemini, LangSmith, SQL URL, Redis/Postgres URL).</w:t>
+        <w:t xml:space="preserve"> Setup .env (Gemini, LangSmith, SQL URL, Redis/Postgres URL)</w:t>
       </w:r>
     </w:p>
     <w:p>
@@ -278,6 +278,124 @@
     </w:p>
     <w:p>
       <w:pPr>
+        <w:pBdr>
+          <w:bottom w:val="single" w:sz="6" w:space="1" w:color="auto"/>
+        </w:pBdr>
+        <w:ind w:left="360"/>
+        <w:rPr>
+          <w:lang w:val="en-US"/>
+        </w:rPr>
+      </w:pPr>
+      <w:r>
+        <w:t>Ngày xưa ae mình hay dùng os.getenv() rải rác khắp nơi, rất phèn và dễ lỗi. Đã lên Enterprise thì phải dùng pydantic-settings để validate biến môi trường. Thiếu biến nào nó báo lỗi ngay lúc start server, không đợi đến lúc user chat mới crash.</w:t>
+      </w:r>
+    </w:p>
+    <w:p>
+      <w:pPr>
+        <w:pBdr>
+          <w:bottom w:val="single" w:sz="6" w:space="1" w:color="auto"/>
+        </w:pBdr>
+        <w:ind w:left="360"/>
+        <w:rPr>
+          <w:lang w:val="en-US"/>
+        </w:rPr>
+      </w:pPr>
+      <w:r>
+        <w:lastRenderedPageBreak/>
+        <w:t>Điều này cực kỳ nguy hiểm vì thiếu biến môi trường nó sẽ không báo lỗi ngay, mà đợi đến lúc user gọi API mới sập (Runtime Error). Chúng ta dùng pydantic_settings để ứng dụng "Fail Fast" - chết ngay lúc khởi động nếu cấu hình sai.</w:t>
+      </w:r>
+    </w:p>
+    <w:p>
+      <w:pPr>
+        <w:pBdr>
+          <w:bottom w:val="single" w:sz="6" w:space="1" w:color="auto"/>
+        </w:pBdr>
+        <w:ind w:left="360"/>
+        <w:rPr>
+          <w:lang w:val="en-US"/>
+        </w:rPr>
+      </w:pPr>
+      <w:r>
+        <w:rPr>
+          <w:rFonts w:ascii="Segoe UI Emoji" w:hAnsi="Segoe UI Emoji" w:cs="Segoe UI Emoji"/>
+          <w:b/>
+          <w:bCs/>
+        </w:rPr>
+        <w:t>💡</w:t>
+      </w:r>
+      <w:r>
+        <w:rPr>
+          <w:b/>
+          <w:bCs/>
+        </w:rPr>
+        <w:t xml:space="preserve"> </w:t>
+      </w:r>
+      <w:r>
+        <w:rPr>
+          <w:b/>
+          <w:bCs/>
+        </w:rPr>
+        <w:t>Best Practice:</w:t>
+      </w:r>
+      <w:r>
+        <w:t xml:space="preserve"> Với object settings này, sau này ở bất kỳ file nào (VD: database.py), bạn chỉ cần gọi from src.core.config import settings và lấy settings.SQL_DATABASE_URL. Pydantic đảm bảo biến này luôn có giá trị hợp lệ.</w:t>
+      </w:r>
+    </w:p>
+    <w:p>
+      <w:pPr>
+        <w:pBdr>
+          <w:bottom w:val="single" w:sz="6" w:space="1" w:color="auto"/>
+        </w:pBdr>
+        <w:ind w:left="360"/>
+        <w:rPr>
+          <w:lang w:val="en-US"/>
+        </w:rPr>
+      </w:pPr>
+      <w:r>
+        <w:rPr>
+          <w:lang w:val="en-US"/>
+        </w:rPr>
+        <w:t>Exception.py:</w:t>
+      </w:r>
+    </w:p>
+    <w:p>
+      <w:pPr>
+        <w:pBdr>
+          <w:bottom w:val="single" w:sz="6" w:space="1" w:color="auto"/>
+        </w:pBdr>
+        <w:ind w:left="360"/>
+        <w:rPr>
+          <w:lang w:val="en-US"/>
+        </w:rPr>
+      </w:pPr>
+      <w:r>
+        <w:t>Trong Enterprise, API không bao giờ được trả về lỗi gốc (như lỗi SQL hay lỗi thư viện) cho người dùng xem, vì rất dễ bị hack. Ta bọc nó lại.</w:t>
+      </w:r>
+    </w:p>
+    <w:p>
+      <w:pPr>
+        <w:pBdr>
+          <w:bottom w:val="single" w:sz="6" w:space="1" w:color="auto"/>
+        </w:pBdr>
+        <w:ind w:left="360"/>
+        <w:rPr>
+          <w:lang w:val="en-US"/>
+        </w:rPr>
+      </w:pPr>
+    </w:p>
+    <w:p>
+      <w:pPr>
+        <w:pBdr>
+          <w:bottom w:val="single" w:sz="6" w:space="1" w:color="auto"/>
+        </w:pBdr>
+        <w:ind w:left="360"/>
+        <w:rPr>
+          <w:lang w:val="en-US"/>
+        </w:rPr>
+      </w:pPr>
+    </w:p>
+    <w:p>
+      <w:pPr>
         <w:numPr>
           <w:ilvl w:val="0"/>
           <w:numId w:val="13"/>
@@ -291,7 +409,6 @@
           <w:b/>
           <w:bCs/>
         </w:rPr>
-        <w:lastRenderedPageBreak/>
         <w:t>Task 1.3:</w:t>
       </w:r>
       <w:r>
@@ -303,10 +420,59 @@
         <w:pBdr>
           <w:bottom w:val="single" w:sz="6" w:space="1" w:color="auto"/>
         </w:pBdr>
-        <w:rPr>
-          <w:b/>
-          <w:bCs/>
-        </w:rPr>
+        <w:ind w:left="360"/>
+        <w:rPr>
+          <w:lang w:val="en-US"/>
+        </w:rPr>
+      </w:pPr>
+      <w:r>
+        <w:t>Đây là linh hồn của Domain-Driven Design. Chúng ta định nghĩa sẵn các "thực thể" (Entities) của một cửa hàng thương mại điện tử.</w:t>
+      </w:r>
+      <w:r>
+        <w:t xml:space="preserve"> </w:t>
+      </w:r>
+      <w:r>
+        <w:t>(đảm bảo AI nhả data đúng format).</w:t>
+      </w:r>
+    </w:p>
+    <w:p>
+      <w:pPr>
+        <w:pBdr>
+          <w:bottom w:val="single" w:sz="6" w:space="1" w:color="auto"/>
+        </w:pBdr>
+        <w:ind w:left="360"/>
+        <w:rPr>
+          <w:rFonts w:ascii="Segoe UI Emoji" w:eastAsia="Times New Roman" w:hAnsi="Segoe UI Emoji" w:cs="Segoe UI Emoji"/>
+          <w:b/>
+          <w:bCs/>
+          <w:kern w:val="0"/>
+          <w:sz w:val="24"/>
+          <w:lang w:val="en-US" w:eastAsia="vi-VN"/>
+          <w14:ligatures w14:val="none"/>
+        </w:rPr>
+      </w:pPr>
+      <w:r>
+        <w:t>Đây là "ngôn ngữ chung" để FastAPI, LangChain và Frontend giao tiếp với nhau mà không sợ sai lệch kiểu dữ liệu.</w:t>
+      </w:r>
+      <w:r>
+        <w:rPr>
+          <w:rFonts w:ascii="Segoe UI Emoji" w:eastAsia="Times New Roman" w:hAnsi="Segoe UI Emoji" w:cs="Segoe UI Emoji"/>
+          <w:b/>
+          <w:bCs/>
+          <w:kern w:val="0"/>
+          <w:sz w:val="24"/>
+          <w:lang w:eastAsia="vi-VN"/>
+          <w14:ligatures w14:val="none"/>
+        </w:rPr>
+        <w:t xml:space="preserve"> </w:t>
+      </w:r>
+    </w:p>
+    <w:p>
+      <w:pPr>
+        <w:pBdr>
+          <w:bottom w:val="single" w:sz="6" w:space="1" w:color="auto"/>
+        </w:pBdr>
+        <w:ind w:left="360"/>
       </w:pPr>
       <w:r>
         <w:rPr>
@@ -314,14 +480,14 @@
           <w:b/>
           <w:bCs/>
         </w:rPr>
-        <w:t>🧬</w:t>
-      </w:r>
-      <w:r>
-        <w:rPr>
-          <w:b/>
-          <w:bCs/>
-        </w:rPr>
-        <w:t xml:space="preserve"> Phase 2: Hybrid Data Pipeline &amp; Sync Strategy </w:t>
+        <w:t>💡</w:t>
+      </w:r>
+      <w:r>
+        <w:rPr>
+          <w:b/>
+          <w:bCs/>
+        </w:rPr>
+        <w:t xml:space="preserve"> Best Practice:</w:t>
       </w:r>
       <w:r>
         <w:rPr>
@@ -329,24 +495,197 @@
           <w:b/>
           <w:bCs/>
         </w:rPr>
-        <w:t>🌟</w:t>
-      </w:r>
-      <w:r>
-        <w:rPr>
-          <w:b/>
-          <w:bCs/>
+        <w:t>💡</w:t>
+      </w:r>
+      <w:r>
+        <w:rPr>
+          <w:b/>
+          <w:bCs/>
+        </w:rPr>
+        <w:t xml:space="preserve"> Thực tiễn tốt nhất:</w:t>
+      </w:r>
+    </w:p>
+    <w:p>
+      <w:pPr>
+        <w:numPr>
+          <w:ilvl w:val="0"/>
+          <w:numId w:val="21"/>
+        </w:numPr>
+        <w:pBdr>
+          <w:bottom w:val="single" w:sz="6" w:space="1" w:color="auto"/>
+        </w:pBdr>
+      </w:pPr>
+      <w:r>
+        <w:t>Ràng buộc ge=0 (greater than or equal to 0) cho price. Đảm bảo không bao giờ có lỗi hệ thống ghi nhận giá âm.</w:t>
+      </w:r>
+    </w:p>
+    <w:p>
+      <w:pPr>
+        <w:numPr>
+          <w:ilvl w:val="0"/>
+          <w:numId w:val="21"/>
+        </w:numPr>
+        <w:pBdr>
+          <w:bottom w:val="single" w:sz="6" w:space="1" w:color="auto"/>
+        </w:pBdr>
+      </w:pPr>
+      <w:r>
+        <w:t>Regex pattern="^(active|inactive)$" thay thế cho ENUM ở tầng code. Bắt lỗi ngay tại Python trước khi chạm xuống DB.</w:t>
+      </w:r>
+    </w:p>
+    <w:p>
+      <w:pPr>
+        <w:pBdr>
+          <w:bottom w:val="single" w:sz="6" w:space="1" w:color="auto"/>
+        </w:pBdr>
+        <w:ind w:left="360"/>
+        <w:rPr>
+          <w:lang w:val="en-US"/>
+        </w:rPr>
+      </w:pPr>
+      <w:proofErr w:type="gramStart"/>
+      <w:r>
+        <w:rPr>
+          <w:lang w:val="en-US"/>
+        </w:rPr>
+        <w:t>Chat.py :</w:t>
+      </w:r>
+      <w:proofErr w:type="gramEnd"/>
+      <w:r>
+        <w:rPr>
+          <w:lang w:val="en-US"/>
         </w:rPr>
         <w:t xml:space="preserve"> </w:t>
       </w:r>
-      <w:r>
+    </w:p>
+    <w:p>
+      <w:pPr>
+        <w:pBdr>
+          <w:bottom w:val="single" w:sz="6" w:space="1" w:color="auto"/>
+        </w:pBdr>
+        <w:ind w:left="360"/>
+      </w:pPr>
+      <w:r>
+        <w:t>Đây là bộ khung bắt buộc phải có để FastAPI và LangChain hiểu khách hàng đang gửi gì lên và AI phải nhả ra cái gì.</w:t>
+      </w:r>
+    </w:p>
+    <w:p>
+      <w:pPr>
+        <w:pBdr>
+          <w:bottom w:val="single" w:sz="6" w:space="1" w:color="auto"/>
+        </w:pBdr>
+        <w:ind w:left="360"/>
+        <w:rPr>
+          <w:lang w:val="en-US"/>
+        </w:rPr>
+      </w:pPr>
+    </w:p>
+    <w:p>
+      <w:pPr>
+        <w:pBdr>
+          <w:bottom w:val="single" w:sz="6" w:space="1" w:color="auto"/>
+        </w:pBdr>
         <w:rPr>
           <w:b/>
           <w:bCs/>
           <w:i/>
           <w:iCs/>
+          <w:lang w:val="en-US"/>
+        </w:rPr>
+      </w:pPr>
+      <w:r>
+        <w:rPr>
+          <w:rFonts w:ascii="Segoe UI Emoji" w:hAnsi="Segoe UI Emoji" w:cs="Segoe UI Emoji"/>
+          <w:b/>
+          <w:bCs/>
+        </w:rPr>
+        <w:lastRenderedPageBreak/>
+        <w:t>🧬</w:t>
+      </w:r>
+      <w:r>
+        <w:rPr>
+          <w:b/>
+          <w:bCs/>
+        </w:rPr>
+        <w:t xml:space="preserve"> Phase 2: Hybrid Data Pipeline &amp; Sync Strategy </w:t>
+      </w:r>
+      <w:r>
+        <w:rPr>
+          <w:rFonts w:ascii="Segoe UI Emoji" w:hAnsi="Segoe UI Emoji" w:cs="Segoe UI Emoji"/>
+          <w:b/>
+          <w:bCs/>
+        </w:rPr>
+        <w:t>🌟</w:t>
+      </w:r>
+      <w:r>
+        <w:rPr>
+          <w:b/>
+          <w:bCs/>
+        </w:rPr>
+        <w:t xml:space="preserve"> </w:t>
+      </w:r>
+      <w:r>
+        <w:rPr>
+          <w:b/>
+          <w:bCs/>
+          <w:i/>
+          <w:iCs/>
         </w:rPr>
         <w:t>(Điểm nhấn của m)</w:t>
       </w:r>
+    </w:p>
+    <w:p>
+      <w:pPr>
+        <w:pBdr>
+          <w:bottom w:val="single" w:sz="6" w:space="1" w:color="auto"/>
+        </w:pBdr>
+        <w:rPr>
+          <w:lang w:val="en-US"/>
+        </w:rPr>
+      </w:pPr>
+      <w:r>
+        <w:t xml:space="preserve">Ở Phase này, chúng ta sẽ xử lý đoạn text Chính sách bảo hành của AI-Store mà m đã gửi. </w:t>
+      </w:r>
+      <w:r>
+        <w:rPr>
+          <w:b/>
+          <w:bCs/>
+        </w:rPr>
+        <w:t>Tại sao lại là Hybrid?</w:t>
+      </w:r>
+      <w:r>
+        <w:t xml:space="preserve"> Nếu chỉ dùng Vector (ChromaDB), AI sẽ tìm theo "ngữ nghĩa" (Semantic). Nhưng trong E-commerce, khách hay gõ chính xác mã sản phẩm hoặc từ khóa cứng (như "1 đổi 1", "Jailbreak"). Nếu chỉ dùng Vector, nó có thể tìm trượt. Giải pháp chuẩn Enterprise là kết hợp </w:t>
+      </w:r>
+      <w:r>
+        <w:rPr>
+          <w:b/>
+          <w:bCs/>
+        </w:rPr>
+        <w:t>ChromaDB (Não phải - Cảm thụ ý nghĩa)</w:t>
+      </w:r>
+      <w:r>
+        <w:t xml:space="preserve"> và </w:t>
+      </w:r>
+      <w:r>
+        <w:rPr>
+          <w:b/>
+          <w:bCs/>
+        </w:rPr>
+        <w:t>BM25 (Não trái - Khớp chính xác từ khóa)</w:t>
+      </w:r>
+      <w:r>
+        <w:t>.</w:t>
+      </w:r>
+    </w:p>
+    <w:p>
+      <w:pPr>
+        <w:pBdr>
+          <w:bottom w:val="single" w:sz="6" w:space="1" w:color="auto"/>
+        </w:pBdr>
+        <w:rPr>
+          <w:lang w:val="en-US"/>
+        </w:rPr>
+      </w:pPr>
     </w:p>
     <w:p>
       <w:pPr>
@@ -396,6 +735,9 @@
           <w:bottom w:val="single" w:sz="6" w:space="1" w:color="auto"/>
         </w:pBdr>
         <w:ind w:left="360"/>
+        <w:rPr>
+          <w:lang w:val="en-US"/>
+        </w:rPr>
       </w:pPr>
       <w:r>
         <w:t>(</w:t>
@@ -423,6 +765,54 @@
       <w:r>
         <w:t>.</w:t>
       </w:r>
+    </w:p>
+    <w:p>
+      <w:pPr>
+        <w:pBdr>
+          <w:bottom w:val="single" w:sz="6" w:space="1" w:color="auto"/>
+        </w:pBdr>
+        <w:ind w:left="360"/>
+        <w:rPr>
+          <w:lang w:val="en-US"/>
+        </w:rPr>
+      </w:pPr>
+      <w:r>
+        <w:rPr>
+          <w:rFonts w:ascii="Segoe UI Emoji" w:hAnsi="Segoe UI Emoji" w:cs="Segoe UI Emoji"/>
+          <w:b/>
+          <w:bCs/>
+        </w:rPr>
+        <w:t>💡</w:t>
+      </w:r>
+      <w:r>
+        <w:rPr>
+          <w:b/>
+          <w:bCs/>
+        </w:rPr>
+        <w:t xml:space="preserve"> Best Practice ở đây là</w:t>
+      </w:r>
+      <w:r>
+        <w:rPr>
+          <w:b/>
+          <w:bCs/>
+          <w:lang w:val="en-US"/>
+        </w:rPr>
+        <w:t xml:space="preserve">: </w:t>
+      </w:r>
+      <w:r>
+        <w:t>Chúng ta lưu BM25Okapi object và cả mảng chunks xuống một file nhị phân .pkl. Tốc độ đọc file .pkl này lên RAM sau này (ở Phase 4) là tính bằng mili-giây (siêu tốc), không làm chậm hệ thống API của m.</w:t>
+      </w:r>
+    </w:p>
+    <w:p>
+      <w:pPr>
+        <w:pBdr>
+          <w:bottom w:val="single" w:sz="6" w:space="1" w:color="auto"/>
+        </w:pBdr>
+        <w:ind w:left="360"/>
+        <w:rPr>
+          <w:lang w:val="en-US"/>
+        </w:rPr>
+      </w:pPr>
     </w:p>
     <w:p>
       <w:pPr>
@@ -493,6 +883,7 @@
     </w:p>
     <w:p>
       <w:r>
+        <w:lastRenderedPageBreak/>
         <w:t>Nếu hôm nay Admin vào SQL Server đổi giá cái "Tai nghe Sony" từ 3.5 củ xuống 3 củ, mà ChromaDB không biết, thì con LLM nhặt data cũ lên tư vấn sẽ bị khách chửi ngay.</w:t>
       </w:r>
       <w:r>
@@ -500,6 +891,11 @@
       </w:r>
     </w:p>
     <w:p>
+      <w:pPr>
+        <w:rPr>
+          <w:lang w:val="en-US"/>
+        </w:rPr>
+      </w:pPr>
       <w:r>
         <w:t xml:space="preserve">Ta cần một file </w:t>
       </w:r>
@@ -513,6 +909,81 @@
       <w:r>
         <w:t>. Kịch bản là: Hệ thống sẽ quét SQL Server, lấy giá mới nhất và "đắp" vào Metadata của ChromaDB.</w:t>
       </w:r>
+    </w:p>
+    <w:p>
+      <w:pPr>
+        <w:rPr>
+          <w:lang w:val="en-US"/>
+        </w:rPr>
+      </w:pPr>
+    </w:p>
+    <w:p>
+      <w:r>
+        <w:rPr>
+          <w:rFonts w:ascii="Segoe UI Emoji" w:hAnsi="Segoe UI Emoji" w:cs="Segoe UI Emoji"/>
+          <w:b/>
+          <w:bCs/>
+        </w:rPr>
+        <w:t>💡</w:t>
+      </w:r>
+      <w:r>
+        <w:rPr>
+          <w:b/>
+          <w:bCs/>
+        </w:rPr>
+        <w:t xml:space="preserve"> Tại sao làm thế này (Best Practices)?</w:t>
+      </w:r>
+    </w:p>
+    <w:p>
+      <w:pPr>
+        <w:numPr>
+          <w:ilvl w:val="0"/>
+          <w:numId w:val="22"/>
+        </w:numPr>
+      </w:pPr>
+      <w:r>
+        <w:rPr>
+          <w:b/>
+          <w:bCs/>
+        </w:rPr>
+        <w:t>Quản lý ID Chủ động:</w:t>
+      </w:r>
+      <w:r>
+        <w:t xml:space="preserve"> T cố tình tạo ra doc_id = f"prod_{row['product_id']}". Nếu m không cấp ID, ChromaDB sẽ tự đẻ ra chuỗi hash ngẫu nhiên. Khi SQL cập nhật giá, ChromaDB không biết ID cũ là thằng nào nên nó đẻ ra 1 vector mới (gây trùng lặp data). Có ID cứng, lệnh add_texts sẽ hoạt động như lệnh UPSERT (Có rồi thì Update, Chưa có thì Insert).</w:t>
+      </w:r>
+    </w:p>
+    <w:p>
+      <w:pPr>
+        <w:numPr>
+          <w:ilvl w:val="0"/>
+          <w:numId w:val="22"/>
+        </w:numPr>
+      </w:pPr>
+      <w:r>
+        <w:rPr>
+          <w:b/>
+          <w:bCs/>
+        </w:rPr>
+        <w:t>Metadata Filtering:</w:t>
+      </w:r>
+      <w:r>
+        <w:t xml:space="preserve"> Tách riêng price thành kiểu float trong metadata. Sang Phase 4, ta sẽ dùng LangChain để ra lệnh: </w:t>
+      </w:r>
+      <w:r>
+        <w:rPr>
+          <w:i/>
+          <w:iCs/>
+        </w:rPr>
+        <w:t>"Chỉ lấy những vector có metadata price &lt;= 500000"</w:t>
+      </w:r>
+      <w:r>
+        <w:t>.</w:t>
+      </w:r>
+    </w:p>
+    <w:p>
+      <w:pPr>
+        <w:ind w:left="360"/>
+      </w:pPr>
     </w:p>
     <w:p>
       <w:pPr>
@@ -522,6 +993,7 @@
         <w:rPr>
           <w:b/>
           <w:bCs/>
+          <w:lang w:val="en-US"/>
         </w:rPr>
       </w:pPr>
       <w:r>
@@ -539,6 +1011,43 @@
         </w:rPr>
         <w:t xml:space="preserve"> Phase 3: Cơ sở dữ liệu &amp; Chế tạo vũ khí (DB &amp; Tools)</w:t>
       </w:r>
+    </w:p>
+    <w:p>
+      <w:r>
+        <w:rPr>
+          <w:rFonts w:ascii="Segoe UI Emoji" w:hAnsi="Segoe UI Emoji" w:cs="Segoe UI Emoji"/>
+        </w:rPr>
+        <w:t>💡</w:t>
+      </w:r>
+      <w:r>
+        <w:t xml:space="preserve"> Tại sao phải chế tạo Tools? (Best Practice)</w:t>
+      </w:r>
+      <w:r>
+        <w:rPr>
+          <w:lang w:val="en-US"/>
+        </w:rPr>
+        <w:t xml:space="preserve"> :</w:t>
+      </w:r>
+      <w:r>
+        <w:t xml:space="preserve">Thay vì để con AI tự do viết lệnh SQL (rất dễ bị khách hàng lừa viết lệnh DROP TABLE products - SQL Injection qua Prompt), chúng ta sẽ bọc SQL lại thành các </w:t>
+      </w:r>
+      <w:r>
+        <w:rPr>
+          <w:b/>
+          <w:bCs/>
+        </w:rPr>
+        <w:t>Hàm an toàn (Tools)</w:t>
+      </w:r>
+      <w:r>
+        <w:t>. AI chỉ được phép "bấm nút" gọi hàm, còn việc chọc vào SQL Server thế nào là do code Python của mình quyết định. Cực kỳ bảo mật!</w:t>
+      </w:r>
+    </w:p>
+    <w:p>
+      <w:pPr>
+        <w:rPr>
+          <w:lang w:val="en-US"/>
+        </w:rPr>
+      </w:pPr>
     </w:p>
     <w:p>
       <w:pPr>
@@ -577,6 +1086,28 @@
     </w:p>
     <w:p>
       <w:pPr>
+        <w:pBdr>
+          <w:bottom w:val="single" w:sz="6" w:space="1" w:color="auto"/>
+        </w:pBdr>
+        <w:ind w:left="360"/>
+        <w:rPr>
+          <w:lang w:val="en-US"/>
+        </w:rPr>
+      </w:pPr>
+      <w:r>
+        <w:t>File này có nhiệm vụ cực kỳ đơn giản nhưng quan trọng: Load cái thư mục data/chroma_db lên thành một đối tượng VectorStore của LangChain để các Phase sau tái sử dụng, tránh việc cứ mỗi lần khách hỏi lại phải load DB lại từ đầu (gây tốn RAM và chậm hệ thống).</w:t>
+      </w:r>
+    </w:p>
+    <w:p>
+      <w:pPr>
+        <w:pBdr>
+          <w:bottom w:val="single" w:sz="6" w:space="1" w:color="auto"/>
+        </w:pBdr>
+        <w:ind w:left="360"/>
+      </w:pPr>
+    </w:p>
+    <w:p>
+      <w:pPr>
         <w:numPr>
           <w:ilvl w:val="0"/>
           <w:numId w:val="15"/>
@@ -602,49 +1133,60 @@
         <w:pBdr>
           <w:bottom w:val="single" w:sz="6" w:space="1" w:color="auto"/>
         </w:pBdr>
-        <w:rPr>
-          <w:b/>
-          <w:bCs/>
-        </w:rPr>
-      </w:pPr>
+        <w:ind w:left="360"/>
+      </w:pPr>
+      <w:r>
+        <w:t>Tra cứu Giá và Tìm theo Danh mục.</w:t>
+      </w:r>
+    </w:p>
+    <w:p>
       <w:r>
         <w:rPr>
           <w:rFonts w:ascii="Segoe UI Emoji" w:hAnsi="Segoe UI Emoji" w:cs="Segoe UI Emoji"/>
           <w:b/>
           <w:bCs/>
         </w:rPr>
-        <w:t>🧠</w:t>
-      </w:r>
-      <w:r>
-        <w:rPr>
-          <w:b/>
-          <w:bCs/>
-        </w:rPr>
-        <w:t xml:space="preserve"> Phase 4: Trái tim LCEL (The Advanced Engine) </w:t>
-      </w:r>
-      <w:r>
-        <w:rPr>
-          <w:rFonts w:ascii="Segoe UI Emoji" w:hAnsi="Segoe UI Emoji" w:cs="Segoe UI Emoji"/>
-          <w:b/>
-          <w:bCs/>
-        </w:rPr>
-        <w:t>🌟</w:t>
-      </w:r>
-      <w:r>
-        <w:rPr>
-          <w:b/>
-          <w:bCs/>
-        </w:rPr>
-        <w:t xml:space="preserve"> </w:t>
-      </w:r>
-      <w:r>
-        <w:rPr>
-          <w:b/>
-          <w:bCs/>
+        <w:t>💡</w:t>
+      </w:r>
+      <w:r>
+        <w:rPr>
+          <w:b/>
+          <w:bCs/>
+        </w:rPr>
+        <w:t xml:space="preserve"> Best Practice ở đây là gì?</w:t>
+      </w:r>
+      <w:r>
+        <w:t xml:space="preserve"> M nhìn kỹ cái chuỗi """Hữu ích khi...""" nằm ngay dưới tên hàm. Trong LangChain, đó KHÔNG PHẢI là comment cho lập trình viên đọc, mà là </w:t>
+      </w:r>
+      <w:r>
+        <w:rPr>
+          <w:b/>
+          <w:bCs/>
+        </w:rPr>
+        <w:t>Prompt dành cho con LLM</w:t>
+      </w:r>
+      <w:r>
+        <w:t xml:space="preserve">. Khi khách chat: </w:t>
+      </w:r>
+      <w:r>
+        <w:rPr>
           <w:i/>
           <w:iCs/>
         </w:rPr>
-        <w:t>(Điểm nhấn của m)</w:t>
+        <w:t>"Giá tai nghe nhiêu shop?"</w:t>
+      </w:r>
+      <w:r>
+        <w:t xml:space="preserve">, con Gemini sẽ đọc docstring này và tự nhận thức: </w:t>
+      </w:r>
+      <w:r>
+        <w:rPr>
+          <w:i/>
+          <w:iCs/>
+        </w:rPr>
+        <w:t>"À, khách hỏi giá, mình phải kích hoạt tool check_product_status_and_price và truyền chữ 'tai nghe' vào"</w:t>
+      </w:r>
+      <w:r>
+        <w:t>. Đừng bao giờ viết Docstring hời hợt khi làm AI Agent!</w:t>
       </w:r>
     </w:p>
     <w:p>
@@ -652,14 +1194,147 @@
         <w:pBdr>
           <w:bottom w:val="single" w:sz="6" w:space="1" w:color="auto"/>
         </w:pBdr>
-      </w:pPr>
-      <w:r>
-        <w:rPr>
+        <w:rPr>
+          <w:b/>
+          <w:bCs/>
+        </w:rPr>
+      </w:pPr>
+      <w:r>
+        <w:rPr>
+          <w:rFonts w:ascii="Segoe UI Emoji" w:hAnsi="Segoe UI Emoji" w:cs="Segoe UI Emoji"/>
+          <w:b/>
+          <w:bCs/>
+        </w:rPr>
+        <w:t>🧠</w:t>
+      </w:r>
+      <w:r>
+        <w:rPr>
+          <w:b/>
+          <w:bCs/>
+        </w:rPr>
+        <w:t xml:space="preserve"> Phase 4: Trái tim LCEL (The Advanced Engine) </w:t>
+      </w:r>
+      <w:r>
+        <w:rPr>
+          <w:rFonts w:ascii="Segoe UI Emoji" w:hAnsi="Segoe UI Emoji" w:cs="Segoe UI Emoji"/>
+          <w:b/>
+          <w:bCs/>
+        </w:rPr>
+        <w:t>🌟</w:t>
+      </w:r>
+      <w:r>
+        <w:rPr>
+          <w:b/>
+          <w:bCs/>
+        </w:rPr>
+        <w:t xml:space="preserve"> </w:t>
+      </w:r>
+      <w:r>
+        <w:rPr>
+          <w:b/>
+          <w:bCs/>
           <w:i/>
           <w:iCs/>
         </w:rPr>
+        <w:t>(Điểm nhấn của m)</w:t>
+      </w:r>
+    </w:p>
+    <w:p>
+      <w:pPr>
+        <w:pBdr>
+          <w:bottom w:val="single" w:sz="6" w:space="1" w:color="auto"/>
+        </w:pBdr>
+        <w:rPr>
+          <w:i/>
+          <w:iCs/>
+          <w:lang w:val="en-US"/>
+        </w:rPr>
+      </w:pPr>
+      <w:r>
+        <w:rPr>
+          <w:i/>
+          <w:iCs/>
+        </w:rPr>
         <w:t>Phần cốt lõi khó nhất, ghép nối tư duy của AI.</w:t>
       </w:r>
+    </w:p>
+    <w:p>
+      <w:pPr>
+        <w:pBdr>
+          <w:bottom w:val="single" w:sz="6" w:space="1" w:color="auto"/>
+        </w:pBdr>
+        <w:ind w:left="360"/>
+        <w:rPr>
+          <w:lang w:val="en-US"/>
+        </w:rPr>
+      </w:pPr>
+      <w:r>
+        <w:t>Chatbot E-commerce mà quên khách vừa hỏi gì ở câu trước thì vứt. LangChain mặc định lưu chat trong RAM (ConversationBufferMemory), server restart là mất sạch. Đã dùng SQL Server ở Phase 3, tội gì ta không dùng nó để lưu lịch sử chat luôn</w:t>
+      </w:r>
+      <w:r>
+        <w:rPr>
+          <w:lang w:val="en-US"/>
+        </w:rPr>
+        <w:t>:</w:t>
+      </w:r>
+    </w:p>
+    <w:p>
+      <w:pPr>
+        <w:pBdr>
+          <w:bottom w:val="single" w:sz="6" w:space="1" w:color="auto"/>
+        </w:pBdr>
+        <w:ind w:left="360"/>
+      </w:pPr>
+      <w:r>
+        <w:rPr>
+          <w:b/>
+          <w:bCs/>
+        </w:rPr>
+        <w:t>Task 4.1 - Memory:</w:t>
+      </w:r>
+      <w:r>
+        <w:t xml:space="preserve"> Code src/engine/memory.py dùng PostgresChatMessageHistory lưu hội thoại vĩnh viễn.</w:t>
+      </w:r>
+    </w:p>
+    <w:p>
+      <w:pPr>
+        <w:pBdr>
+          <w:bottom w:val="single" w:sz="6" w:space="1" w:color="auto"/>
+        </w:pBdr>
+        <w:ind w:left="360"/>
+        <w:rPr>
+          <w:lang w:val="en-US"/>
+        </w:rPr>
+      </w:pPr>
+      <w:r>
+        <w:rPr>
+          <w:rFonts w:ascii="Segoe UI Emoji" w:hAnsi="Segoe UI Emoji" w:cs="Segoe UI Emoji"/>
+          <w:b/>
+          <w:bCs/>
+        </w:rPr>
+        <w:t>💡</w:t>
+      </w:r>
+      <w:r>
+        <w:rPr>
+          <w:b/>
+          <w:bCs/>
+        </w:rPr>
+        <w:t xml:space="preserve"> Best Practice:</w:t>
+      </w:r>
+      <w:r>
+        <w:t xml:space="preserve"> Cách này giúp m scale app thoải mái. Dù m có chạy 10 cái server FastAPI song song, thì khách hàng quay lại vẫn được nhận diện vì trí nhớ nằm tập trung dưới DB!</w:t>
+      </w:r>
+    </w:p>
+    <w:p>
+      <w:pPr>
+        <w:pBdr>
+          <w:bottom w:val="single" w:sz="6" w:space="1" w:color="auto"/>
+        </w:pBdr>
+        <w:ind w:left="360"/>
+        <w:rPr>
+          <w:lang w:val="en-US"/>
+        </w:rPr>
+      </w:pPr>
     </w:p>
     <w:p>
       <w:pPr>
@@ -676,10 +1351,31 @@
           <w:b/>
           <w:bCs/>
         </w:rPr>
-        <w:t>Task 4.1 - Memory:</w:t>
-      </w:r>
-      <w:r>
-        <w:t xml:space="preserve"> Code src/engine/memory.py dùng PostgresChatMessageHistory lưu hội thoại vĩnh viễn.</w:t>
+        <w:t>Task 4.2 - Hybrid Retriever:</w:t>
+      </w:r>
+      <w:r>
+        <w:t xml:space="preserve"> Code src/engine/retriever.py. Dùng EnsembleRetriever kết hợp sức mạnh của BM25Retriever (từ khóa) và Chroma (ngữ nghĩa) với tỷ lệ 0.4 - 0.6.</w:t>
+      </w:r>
+    </w:p>
+    <w:p>
+      <w:pPr>
+        <w:pBdr>
+          <w:bottom w:val="single" w:sz="6" w:space="1" w:color="auto"/>
+        </w:pBdr>
+        <w:ind w:left="360"/>
+      </w:pPr>
+      <w:r>
+        <w:t xml:space="preserve">Đây chính là tuyệt chiêu </w:t>
+      </w:r>
+      <w:r>
+        <w:rPr>
+          <w:b/>
+          <w:bCs/>
+        </w:rPr>
+        <w:t>Hybrid Search</w:t>
+      </w:r>
+      <w:r>
+        <w:t xml:space="preserve"> mà m yêu cầu bổ sung lúc trước. Nó sẽ lấy kết quả từ VectorDB (Chroma) trộn với kết quả từ Keyword Search (BM25) và tự động tính điểm lại (Re-rank) để chọn ra câu trả lời đỉnh nhất.</w:t>
       </w:r>
     </w:p>
     <w:p>
@@ -697,45 +1393,24 @@
           <w:b/>
           <w:bCs/>
         </w:rPr>
-        <w:t>Task 4.2 - Hybrid Retriever:</w:t>
-      </w:r>
-      <w:r>
-        <w:t xml:space="preserve"> Code src/engine/retriever.py. Dùng EnsembleRetriever kết hợp sức mạnh của BM25Retriever (từ khóa) và Chroma (ngữ nghĩa) với tỷ lệ 0.4 - 0.6.</w:t>
-      </w:r>
-    </w:p>
-    <w:p>
-      <w:pPr>
-        <w:numPr>
-          <w:ilvl w:val="0"/>
-          <w:numId w:val="16"/>
-        </w:numPr>
+        <w:t>Task 4.3 - Router &amp; Handoff:</w:t>
+      </w:r>
+      <w:r>
+        <w:t xml:space="preserve"> Code src/engine/router.py. Phân ra các luồng: RAG thường, Agent (Tools), Chitchat. </w:t>
+      </w:r>
+      <w:r>
+        <w:rPr>
+          <w:b/>
+          <w:bCs/>
+        </w:rPr>
+        <w:t>Thêm logic nhận diện ý định cãi nhau/gặp nhân viên để đẩy vào luồng Human Handoff.</w:t>
+      </w:r>
+    </w:p>
+    <w:p>
+      <w:pPr>
         <w:pBdr>
           <w:bottom w:val="single" w:sz="6" w:space="1" w:color="auto"/>
         </w:pBdr>
-      </w:pPr>
-      <w:r>
-        <w:rPr>
-          <w:b/>
-          <w:bCs/>
-        </w:rPr>
-        <w:t>Task 4.3 - Router &amp; Handoff:</w:t>
-      </w:r>
-      <w:r>
-        <w:t xml:space="preserve"> Code src/engine/router.py. Phân ra các luồng: RAG thường, Agent (Tools), Chitchat. </w:t>
-      </w:r>
-      <w:r>
-        <w:rPr>
-          <w:b/>
-          <w:bCs/>
-        </w:rPr>
-        <w:t>Thêm logic nhận diện ý định cãi nhau/gặp nhân viên để đẩy vào luồng Human Handoff.</w:t>
-      </w:r>
-    </w:p>
-    <w:p>
-      <w:pPr>
-        <w:pBdr>
-          <w:bottom w:val="single" w:sz="6" w:space="1" w:color="auto"/>
-        </w:pBdr>
         <w:rPr>
           <w:b/>
           <w:bCs/>
@@ -747,6 +1422,7 @@
           <w:b/>
           <w:bCs/>
         </w:rPr>
+        <w:lastRenderedPageBreak/>
         <w:t>🛡️</w:t>
       </w:r>
       <w:r>
@@ -997,7 +1673,6 @@
           <w:b/>
           <w:bCs/>
         </w:rPr>
-        <w:lastRenderedPageBreak/>
         <w:t>Task 6.3:</w:t>
       </w:r>
       <w:r>
@@ -1079,6 +1754,7 @@
           <w:b/>
           <w:bCs/>
         </w:rPr>
+        <w:lastRenderedPageBreak/>
         <w:t>Giải pháp:</w:t>
       </w:r>
       <w:r>
@@ -1196,7 +1872,6 @@
           <w:b/>
           <w:bCs/>
         </w:rPr>
-        <w:lastRenderedPageBreak/>
         <w:t>Hiện trạng:</w:t>
       </w:r>
       <w:r>
@@ -1272,6 +1947,408 @@
         <w:pBdr>
           <w:bottom w:val="single" w:sz="6" w:space="1" w:color="auto"/>
         </w:pBdr>
+        <w:rPr>
+          <w:lang w:val="en-US"/>
+        </w:rPr>
+      </w:pPr>
+    </w:p>
+    <w:p>
+      <w:pPr>
+        <w:pBdr>
+          <w:bottom w:val="single" w:sz="6" w:space="1" w:color="auto"/>
+        </w:pBdr>
+        <w:rPr>
+          <w:lang w:val="en-US"/>
+        </w:rPr>
+      </w:pPr>
+    </w:p>
+    <w:p>
+      <w:pPr>
+        <w:pBdr>
+          <w:bottom w:val="single" w:sz="6" w:space="1" w:color="auto"/>
+        </w:pBdr>
+        <w:rPr>
+          <w:lang w:val="en-US"/>
+        </w:rPr>
+      </w:pPr>
+    </w:p>
+    <w:p>
+      <w:pPr>
+        <w:pBdr>
+          <w:bottom w:val="single" w:sz="6" w:space="1" w:color="auto"/>
+        </w:pBdr>
+        <w:rPr>
+          <w:lang w:val="en-US"/>
+        </w:rPr>
+      </w:pPr>
+    </w:p>
+    <w:p>
+      <w:pPr>
+        <w:pBdr>
+          <w:bottom w:val="single" w:sz="6" w:space="1" w:color="auto"/>
+        </w:pBdr>
+        <w:rPr>
+          <w:lang w:val="en-US"/>
+        </w:rPr>
+      </w:pPr>
+    </w:p>
+    <w:p>
+      <w:pPr>
+        <w:pBdr>
+          <w:bottom w:val="single" w:sz="6" w:space="1" w:color="auto"/>
+        </w:pBdr>
+        <w:rPr>
+          <w:lang w:val="en-US"/>
+        </w:rPr>
+      </w:pPr>
+    </w:p>
+    <w:p>
+      <w:pPr>
+        <w:pBdr>
+          <w:bottom w:val="single" w:sz="6" w:space="1" w:color="auto"/>
+        </w:pBdr>
+        <w:rPr>
+          <w:lang w:val="en-US"/>
+        </w:rPr>
+      </w:pPr>
+    </w:p>
+    <w:p>
+      <w:pPr>
+        <w:pBdr>
+          <w:bottom w:val="single" w:sz="6" w:space="1" w:color="auto"/>
+        </w:pBdr>
+        <w:rPr>
+          <w:lang w:val="en-US"/>
+        </w:rPr>
+      </w:pPr>
+    </w:p>
+    <w:p>
+      <w:pPr>
+        <w:pBdr>
+          <w:bottom w:val="single" w:sz="6" w:space="1" w:color="auto"/>
+        </w:pBdr>
+        <w:rPr>
+          <w:lang w:val="en-US"/>
+        </w:rPr>
+      </w:pPr>
+    </w:p>
+    <w:p>
+      <w:pPr>
+        <w:pBdr>
+          <w:bottom w:val="single" w:sz="6" w:space="1" w:color="auto"/>
+        </w:pBdr>
+        <w:rPr>
+          <w:lang w:val="en-US"/>
+        </w:rPr>
+      </w:pPr>
+    </w:p>
+    <w:p>
+      <w:pPr>
+        <w:rPr>
+          <w:b/>
+          <w:bCs/>
+        </w:rPr>
+      </w:pPr>
+      <w:r>
+        <w:rPr>
+          <w:b/>
+          <w:bCs/>
+        </w:rPr>
+        <w:t>1. RecursiveCharacterTextSplitter (Băm cơ học - "Gã tiều phu")1. RecursiveCharacterTextSplitter (Băm cơ học - "Gã tiều phu")</w:t>
+      </w:r>
+    </w:p>
+    <w:p>
+      <w:r>
+        <w:t xml:space="preserve">Thằng này hoạt động như một cái máy chém với thước đo được thiết lập sẵn. M bảo nó: </w:t>
+      </w:r>
+      <w:r>
+        <w:rPr>
+          <w:i/>
+          <w:iCs/>
+        </w:rPr>
+        <w:t>"Cắt cho tao mỗi cục 1000 ký tự"</w:t>
+      </w:r>
+      <w:r>
+        <w:t>.</w:t>
+      </w:r>
+    </w:p>
+    <w:p>
+      <w:pPr>
+        <w:numPr>
+          <w:ilvl w:val="0"/>
+          <w:numId w:val="23"/>
+        </w:numPr>
+      </w:pPr>
+      <w:r>
+        <w:rPr>
+          <w:b/>
+          <w:bCs/>
+        </w:rPr>
+        <w:t>Cách nó làm:</w:t>
+      </w:r>
+      <w:r>
+        <w:t xml:space="preserve"> Nó sẽ đếm đủ 1000 ký tự là nó "phập". Để đỡ vô duyên, nó sẽ ưu tiên cắt ở các dấu xuống dòng \n\n, rồi đến dấu chấm câu ., rồi mới đến dấu cách .</w:t>
+      </w:r>
+    </w:p>
+    <w:p>
+      <w:pPr>
+        <w:numPr>
+          <w:ilvl w:val="0"/>
+          <w:numId w:val="23"/>
+        </w:numPr>
+      </w:pPr>
+      <w:r>
+        <w:rPr>
+          <w:b/>
+          <w:bCs/>
+        </w:rPr>
+        <w:t>Điểm mạnh:</w:t>
+      </w:r>
+      <w:r>
+        <w:t xml:space="preserve"> Cực kỳ nhanh, không tốn tiền API (vì nó đếm chữ offline), các chunk sinh ra có kích thước rất đều nhau.</w:t>
+      </w:r>
+    </w:p>
+    <w:p>
+      <w:pPr>
+        <w:numPr>
+          <w:ilvl w:val="0"/>
+          <w:numId w:val="23"/>
+        </w:numPr>
+      </w:pPr>
+      <w:r>
+        <w:rPr>
+          <w:b/>
+          <w:bCs/>
+        </w:rPr>
+        <w:t>Điểm yếu (Chí mạng):</w:t>
+      </w:r>
+      <w:r>
+        <w:t xml:space="preserve"> </w:t>
+      </w:r>
+      <w:r>
+        <w:rPr>
+          <w:b/>
+          <w:bCs/>
+        </w:rPr>
+        <w:t>NÓ BỊ MÙ NGỮ NGHĨA.</w:t>
+      </w:r>
+    </w:p>
+    <w:p>
+      <w:pPr>
+        <w:numPr>
+          <w:ilvl w:val="1"/>
+          <w:numId w:val="23"/>
+        </w:numPr>
+      </w:pPr>
+      <w:r>
+        <w:rPr>
+          <w:i/>
+          <w:iCs/>
+        </w:rPr>
+        <w:t>Ví dụ:</w:t>
+      </w:r>
+      <w:r>
+        <w:t xml:space="preserve"> Đoạn văn bản là: </w:t>
+      </w:r>
+      <w:r>
+        <w:rPr>
+          <w:i/>
+          <w:iCs/>
+        </w:rPr>
+        <w:t>"Sản phẩm đổi trả phải còn nguyên tem mác. Nếu mất tem mác, cửa hàng sẽ thu phí 20%."</w:t>
+      </w:r>
+    </w:p>
+    <w:p>
+      <w:pPr>
+        <w:numPr>
+          <w:ilvl w:val="1"/>
+          <w:numId w:val="23"/>
+        </w:numPr>
+      </w:pPr>
+      <w:r>
+        <w:t xml:space="preserve">Giả sử đến chữ </w:t>
+      </w:r>
+      <w:r>
+        <w:rPr>
+          <w:i/>
+          <w:iCs/>
+        </w:rPr>
+        <w:t>"tem mác."</w:t>
+      </w:r>
+      <w:r>
+        <w:t xml:space="preserve"> là đúng ký tự thứ 1000. Nó sẽ cắt cái rụp ở đó.</w:t>
+      </w:r>
+    </w:p>
+    <w:p>
+      <w:pPr>
+        <w:numPr>
+          <w:ilvl w:val="1"/>
+          <w:numId w:val="23"/>
+        </w:numPr>
+      </w:pPr>
+      <w:r>
+        <w:t xml:space="preserve">Hậu quả: Chunk 1 chứa điều kiện, Chunk 2 chứa mức phạt. Con AI truy xuất trúng Chunk 1 sẽ bảo khách: </w:t>
+      </w:r>
+      <w:r>
+        <w:rPr>
+          <w:i/>
+          <w:iCs/>
+        </w:rPr>
+        <w:t>"Dạ đổi trả thoải mái ạ"</w:t>
+      </w:r>
+      <w:r>
+        <w:t>, làm công ty đền ốm đòn.</w:t>
+      </w:r>
+    </w:p>
+    <w:p>
+      <w:pPr>
+        <w:rPr>
+          <w:b/>
+          <w:bCs/>
+        </w:rPr>
+      </w:pPr>
+      <w:r>
+        <w:rPr>
+          <w:b/>
+          <w:bCs/>
+        </w:rPr>
+        <w:t>2. SemanticChunker (Băm ngữ nghĩa - "Bác sĩ phẫu thuật")</w:t>
+      </w:r>
+    </w:p>
+    <w:p>
+      <w:r>
+        <w:lastRenderedPageBreak/>
+        <w:t>Đây là cái m đang dùng. Thằng này không quan tâm độ dài ngắn, nó cắt bằng "Ý nghĩa".</w:t>
+      </w:r>
+    </w:p>
+    <w:p>
+      <w:pPr>
+        <w:numPr>
+          <w:ilvl w:val="0"/>
+          <w:numId w:val="24"/>
+        </w:numPr>
+      </w:pPr>
+      <w:r>
+        <w:rPr>
+          <w:b/>
+          <w:bCs/>
+        </w:rPr>
+        <w:t>Cách nó làm:</w:t>
+      </w:r>
+      <w:r>
+        <w:t xml:space="preserve"> Nó dùng chính con LLM (Gemini Embedding) để đọc hiểu từng câu. Nó biến câu 1 thành vector, câu 2 thành vector, rồi đo khoảng cách giữa 2 câu.</w:t>
+      </w:r>
+    </w:p>
+    <w:p>
+      <w:pPr>
+        <w:numPr>
+          <w:ilvl w:val="1"/>
+          <w:numId w:val="24"/>
+        </w:numPr>
+      </w:pPr>
+      <w:r>
+        <w:t>Nếu câu 1 đang nói về "Đổi trả", câu 2 cũng nói về "Đổi trả" -&gt; Khoảng cách gần -&gt; Nó gộp chung vào 1 Chunk.</w:t>
+      </w:r>
+    </w:p>
+    <w:p>
+      <w:pPr>
+        <w:numPr>
+          <w:ilvl w:val="1"/>
+          <w:numId w:val="24"/>
+        </w:numPr>
+      </w:pPr>
+      <w:r>
+        <w:t>Đến câu 3 bỗng nhiên chuyển sang "Bảo hành" -&gt; Ý nghĩa thay đổi đột ngột (vượt qua cái percentile m cài đặt) -&gt; Nó sẽ "cắt" ở giữa câu 2 và câu 3.</w:t>
+      </w:r>
+    </w:p>
+    <w:p>
+      <w:pPr>
+        <w:numPr>
+          <w:ilvl w:val="0"/>
+          <w:numId w:val="24"/>
+        </w:numPr>
+      </w:pPr>
+      <w:r>
+        <w:rPr>
+          <w:b/>
+          <w:bCs/>
+        </w:rPr>
+        <w:t>Điểm mạnh:</w:t>
+      </w:r>
+      <w:r>
+        <w:t xml:space="preserve"> Bảo toàn ngữ cảnh (Context) cực kỳ hoàn hảo. Mỗi Chunk là một ý trọn vẹn. Câu hỏi của khách sẽ tìm được đáp án chính xác 100% không bị cắt cụt.</w:t>
+      </w:r>
+    </w:p>
+    <w:p>
+      <w:pPr>
+        <w:numPr>
+          <w:ilvl w:val="0"/>
+          <w:numId w:val="24"/>
+        </w:numPr>
+      </w:pPr>
+      <w:r>
+        <w:rPr>
+          <w:b/>
+          <w:bCs/>
+        </w:rPr>
+        <w:t>Điểm yếu:</w:t>
+      </w:r>
+      <w:r>
+        <w:t xml:space="preserve"> Chậm hơn và tốn tiền API (vì phải dùng Embedding model để tính toán ngay từ lúc nạp dữ liệu). Kích thước các Chunk có thể cái rất dài, cái rất ngắn.</w:t>
+      </w:r>
+    </w:p>
+    <w:p>
+      <w:r>
+        <w:pict w14:anchorId="136A0486">
+          <v:rect id="_x0000_i1031" style="width:0;height:1.5pt" o:hralign="center" o:hrstd="t" o:hr="t" fillcolor="#a0a0a0" stroked="f"/>
+        </w:pict>
+      </w:r>
+    </w:p>
+    <w:p>
+      <w:pPr>
+        <w:rPr>
+          <w:b/>
+          <w:bCs/>
+        </w:rPr>
+      </w:pPr>
+      <w:r>
+        <w:rPr>
+          <w:b/>
+          <w:bCs/>
+        </w:rPr>
+        <w:t>TỔNG KẾT CHO DỰ ÁN NÀY</w:t>
+      </w:r>
+    </w:p>
+    <w:p>
+      <w:r>
+        <w:t xml:space="preserve">Trong E-commerce, </w:t>
+      </w:r>
+      <w:r>
+        <w:rPr>
+          <w:b/>
+          <w:bCs/>
+        </w:rPr>
+        <w:t>Chính sách cửa hàng (Policy) và Thông số sản phẩm</w:t>
+      </w:r>
+      <w:r>
+        <w:t xml:space="preserve"> là những thứ bắt buộc phải giữ nguyên khối ngữ cảnh. Đang nói về "iPhone 15" không thể cắt cái rụp rồi ném thông số camera sang chunk của "Samsung S24" được. Do đó, dùng SemanticChunker là </w:t>
+      </w:r>
+      <w:r>
+        <w:rPr>
+          <w:b/>
+          <w:bCs/>
+        </w:rPr>
+        <w:t>Best Practice</w:t>
+      </w:r>
+      <w:r>
+        <w:t xml:space="preserve"> giúp AI của m thông minh hơn hẳn các bot cỏ ngoài kia.</w:t>
+      </w:r>
+    </w:p>
+    <w:p>
+      <w:pPr>
+        <w:rPr>
+          <w:lang w:val="en-US"/>
+        </w:rPr>
       </w:pPr>
     </w:p>
     <w:p>
@@ -2340,6 +3417,119 @@
     </w:lvl>
   </w:abstractNum>
   <w:abstractNum w:abstractNumId="4" w15:restartNumberingAfterBreak="0">
+    <w:nsid w:val="200C19D3"/>
+    <w:multiLevelType w:val="multilevel"/>
+    <w:tmpl w:val="C85E7516"/>
+    <w:lvl w:ilvl="0">
+      <w:start w:val="1"/>
+      <w:numFmt w:val="decimal"/>
+      <w:lvlText w:val="%1."/>
+      <w:lvlJc w:val="left"/>
+      <w:pPr>
+        <w:tabs>
+          <w:tab w:val="num" w:pos="720"/>
+        </w:tabs>
+        <w:ind w:left="720" w:hanging="360"/>
+      </w:pPr>
+    </w:lvl>
+    <w:lvl w:ilvl="1" w:tentative="1">
+      <w:start w:val="1"/>
+      <w:numFmt w:val="decimal"/>
+      <w:lvlText w:val="%2."/>
+      <w:lvlJc w:val="left"/>
+      <w:pPr>
+        <w:tabs>
+          <w:tab w:val="num" w:pos="1440"/>
+        </w:tabs>
+        <w:ind w:left="1440" w:hanging="360"/>
+      </w:pPr>
+    </w:lvl>
+    <w:lvl w:ilvl="2" w:tentative="1">
+      <w:start w:val="1"/>
+      <w:numFmt w:val="decimal"/>
+      <w:lvlText w:val="%3."/>
+      <w:lvlJc w:val="left"/>
+      <w:pPr>
+        <w:tabs>
+          <w:tab w:val="num" w:pos="2160"/>
+        </w:tabs>
+        <w:ind w:left="2160" w:hanging="360"/>
+      </w:pPr>
+    </w:lvl>
+    <w:lvl w:ilvl="3" w:tentative="1">
+      <w:start w:val="1"/>
+      <w:numFmt w:val="decimal"/>
+      <w:lvlText w:val="%4."/>
+      <w:lvlJc w:val="left"/>
+      <w:pPr>
+        <w:tabs>
+          <w:tab w:val="num" w:pos="2880"/>
+        </w:tabs>
+        <w:ind w:left="2880" w:hanging="360"/>
+      </w:pPr>
+    </w:lvl>
+    <w:lvl w:ilvl="4" w:tentative="1">
+      <w:start w:val="1"/>
+      <w:numFmt w:val="decimal"/>
+      <w:lvlText w:val="%5."/>
+      <w:lvlJc w:val="left"/>
+      <w:pPr>
+        <w:tabs>
+          <w:tab w:val="num" w:pos="3600"/>
+        </w:tabs>
+        <w:ind w:left="3600" w:hanging="360"/>
+      </w:pPr>
+    </w:lvl>
+    <w:lvl w:ilvl="5" w:tentative="1">
+      <w:start w:val="1"/>
+      <w:numFmt w:val="decimal"/>
+      <w:lvlText w:val="%6."/>
+      <w:lvlJc w:val="left"/>
+      <w:pPr>
+        <w:tabs>
+          <w:tab w:val="num" w:pos="4320"/>
+        </w:tabs>
+        <w:ind w:left="4320" w:hanging="360"/>
+      </w:pPr>
+    </w:lvl>
+    <w:lvl w:ilvl="6" w:tentative="1">
+      <w:start w:val="1"/>
+      <w:numFmt w:val="decimal"/>
+      <w:lvlText w:val="%7."/>
+      <w:lvlJc w:val="left"/>
+      <w:pPr>
+        <w:tabs>
+          <w:tab w:val="num" w:pos="5040"/>
+        </w:tabs>
+        <w:ind w:left="5040" w:hanging="360"/>
+      </w:pPr>
+    </w:lvl>
+    <w:lvl w:ilvl="7" w:tentative="1">
+      <w:start w:val="1"/>
+      <w:numFmt w:val="decimal"/>
+      <w:lvlText w:val="%8."/>
+      <w:lvlJc w:val="left"/>
+      <w:pPr>
+        <w:tabs>
+          <w:tab w:val="num" w:pos="5760"/>
+        </w:tabs>
+        <w:ind w:left="5760" w:hanging="360"/>
+      </w:pPr>
+    </w:lvl>
+    <w:lvl w:ilvl="8" w:tentative="1">
+      <w:start w:val="1"/>
+      <w:numFmt w:val="decimal"/>
+      <w:lvlText w:val="%9."/>
+      <w:lvlJc w:val="left"/>
+      <w:pPr>
+        <w:tabs>
+          <w:tab w:val="num" w:pos="6480"/>
+        </w:tabs>
+        <w:ind w:left="6480" w:hanging="360"/>
+      </w:pPr>
+    </w:lvl>
+  </w:abstractNum>
+  <w:abstractNum w:abstractNumId="5" w15:restartNumberingAfterBreak="0">
     <w:nsid w:val="23D01FAC"/>
     <w:multiLevelType w:val="multilevel"/>
     <w:tmpl w:val="87460C0A"/>
@@ -2488,7 +3678,7 @@
       </w:rPr>
     </w:lvl>
   </w:abstractNum>
-  <w:abstractNum w:abstractNumId="5" w15:restartNumberingAfterBreak="0">
+  <w:abstractNum w:abstractNumId="6" w15:restartNumberingAfterBreak="0">
     <w:nsid w:val="28B85877"/>
     <w:multiLevelType w:val="multilevel"/>
     <w:tmpl w:val="25D23370"/>
@@ -2605,7 +3795,156 @@
       </w:pPr>
     </w:lvl>
   </w:abstractNum>
-  <w:abstractNum w:abstractNumId="6" w15:restartNumberingAfterBreak="0">
+  <w:abstractNum w:abstractNumId="7" w15:restartNumberingAfterBreak="0">
+    <w:nsid w:val="3DF92BDE"/>
+    <w:multiLevelType w:val="multilevel"/>
+    <w:tmpl w:val="1A26A7B2"/>
+    <w:lvl w:ilvl="0">
+      <w:start w:val="1"/>
+      <w:numFmt w:val="bullet"/>
+      <w:lvlText w:val=""/>
+      <w:lvlJc w:val="left"/>
+      <w:pPr>
+        <w:tabs>
+          <w:tab w:val="num" w:pos="720"/>
+        </w:tabs>
+        <w:ind w:left="720" w:hanging="360"/>
+      </w:pPr>
+      <w:rPr>
+        <w:rFonts w:ascii="Symbol" w:hAnsi="Symbol" w:hint="default"/>
+        <w:sz w:val="20"/>
+      </w:rPr>
+    </w:lvl>
+    <w:lvl w:ilvl="1">
+      <w:start w:val="1"/>
+      <w:numFmt w:val="bullet"/>
+      <w:lvlText w:val="o"/>
+      <w:lvlJc w:val="left"/>
+      <w:pPr>
+        <w:tabs>
+          <w:tab w:val="num" w:pos="1440"/>
+        </w:tabs>
+        <w:ind w:left="1440" w:hanging="360"/>
+      </w:pPr>
+      <w:rPr>
+        <w:rFonts w:ascii="Courier New" w:hAnsi="Courier New" w:hint="default"/>
+        <w:sz w:val="20"/>
+      </w:rPr>
+    </w:lvl>
+    <w:lvl w:ilvl="2" w:tentative="1">
+      <w:start w:val="1"/>
+      <w:numFmt w:val="bullet"/>
+      <w:lvlText w:val=""/>
+      <w:lvlJc w:val="left"/>
+      <w:pPr>
+        <w:tabs>
+          <w:tab w:val="num" w:pos="2160"/>
+        </w:tabs>
+        <w:ind w:left="2160" w:hanging="360"/>
+      </w:pPr>
+      <w:rPr>
+        <w:rFonts w:ascii="Wingdings" w:hAnsi="Wingdings" w:hint="default"/>
+        <w:sz w:val="20"/>
+      </w:rPr>
+    </w:lvl>
+    <w:lvl w:ilvl="3" w:tentative="1">
+      <w:start w:val="1"/>
+      <w:numFmt w:val="bullet"/>
+      <w:lvlText w:val=""/>
+      <w:lvlJc w:val="left"/>
+      <w:pPr>
+        <w:tabs>
+          <w:tab w:val="num" w:pos="2880"/>
+        </w:tabs>
+        <w:ind w:left="2880" w:hanging="360"/>
+      </w:pPr>
+      <w:rPr>
+        <w:rFonts w:ascii="Wingdings" w:hAnsi="Wingdings" w:hint="default"/>
+        <w:sz w:val="20"/>
+      </w:rPr>
+    </w:lvl>
+    <w:lvl w:ilvl="4" w:tentative="1">
+      <w:start w:val="1"/>
+      <w:numFmt w:val="bullet"/>
+      <w:lvlText w:val=""/>
+      <w:lvlJc w:val="left"/>
+      <w:pPr>
+        <w:tabs>
+          <w:tab w:val="num" w:pos="3600"/>
+        </w:tabs>
+        <w:ind w:left="3600" w:hanging="360"/>
+      </w:pPr>
+      <w:rPr>
+        <w:rFonts w:ascii="Wingdings" w:hAnsi="Wingdings" w:hint="default"/>
+        <w:sz w:val="20"/>
+      </w:rPr>
+    </w:lvl>
+    <w:lvl w:ilvl="5" w:tentative="1">
+      <w:start w:val="1"/>
+      <w:numFmt w:val="bullet"/>
+      <w:lvlText w:val=""/>
+      <w:lvlJc w:val="left"/>
+      <w:pPr>
+        <w:tabs>
+          <w:tab w:val="num" w:pos="4320"/>
+        </w:tabs>
+        <w:ind w:left="4320" w:hanging="360"/>
+      </w:pPr>
+      <w:rPr>
+        <w:rFonts w:ascii="Wingdings" w:hAnsi="Wingdings" w:hint="default"/>
+        <w:sz w:val="20"/>
+      </w:rPr>
+    </w:lvl>
+    <w:lvl w:ilvl="6" w:tentative="1">
+      <w:start w:val="1"/>
+      <w:numFmt w:val="bullet"/>
+      <w:lvlText w:val=""/>
+      <w:lvlJc w:val="left"/>
+      <w:pPr>
+        <w:tabs>
+          <w:tab w:val="num" w:pos="5040"/>
+        </w:tabs>
+        <w:ind w:left="5040" w:hanging="360"/>
+      </w:pPr>
+      <w:rPr>
+        <w:rFonts w:ascii="Wingdings" w:hAnsi="Wingdings" w:hint="default"/>
+        <w:sz w:val="20"/>
+      </w:rPr>
+    </w:lvl>
+    <w:lvl w:ilvl="7" w:tentative="1">
+      <w:start w:val="1"/>
+      <w:numFmt w:val="bullet"/>
+      <w:lvlText w:val=""/>
+      <w:lvlJc w:val="left"/>
+      <w:pPr>
+        <w:tabs>
+          <w:tab w:val="num" w:pos="5760"/>
+        </w:tabs>
+        <w:ind w:left="5760" w:hanging="360"/>
+      </w:pPr>
+      <w:rPr>
+        <w:rFonts w:ascii="Wingdings" w:hAnsi="Wingdings" w:hint="default"/>
+        <w:sz w:val="20"/>
+      </w:rPr>
+    </w:lvl>
+    <w:lvl w:ilvl="8" w:tentative="1">
+      <w:start w:val="1"/>
+      <w:numFmt w:val="bullet"/>
+      <w:lvlText w:val=""/>
+      <w:lvlJc w:val="left"/>
+      <w:pPr>
+        <w:tabs>
+          <w:tab w:val="num" w:pos="6480"/>
+        </w:tabs>
+        <w:ind w:left="6480" w:hanging="360"/>
+      </w:pPr>
+      <w:rPr>
+        <w:rFonts w:ascii="Wingdings" w:hAnsi="Wingdings" w:hint="default"/>
+        <w:sz w:val="20"/>
+      </w:rPr>
+    </w:lvl>
+  </w:abstractNum>
+  <w:abstractNum w:abstractNumId="8" w15:restartNumberingAfterBreak="0">
     <w:nsid w:val="3E870564"/>
     <w:multiLevelType w:val="multilevel"/>
     <w:tmpl w:val="0EE85C80"/>
@@ -2754,7 +4093,7 @@
       </w:rPr>
     </w:lvl>
   </w:abstractNum>
-  <w:abstractNum w:abstractNumId="7" w15:restartNumberingAfterBreak="0">
+  <w:abstractNum w:abstractNumId="9" w15:restartNumberingAfterBreak="0">
     <w:nsid w:val="3EA051B7"/>
     <w:multiLevelType w:val="multilevel"/>
     <w:tmpl w:val="339C2E36"/>
@@ -2903,7 +4242,7 @@
       </w:rPr>
     </w:lvl>
   </w:abstractNum>
-  <w:abstractNum w:abstractNumId="8" w15:restartNumberingAfterBreak="0">
+  <w:abstractNum w:abstractNumId="10" w15:restartNumberingAfterBreak="0">
     <w:nsid w:val="421A1820"/>
     <w:multiLevelType w:val="multilevel"/>
     <w:tmpl w:val="53C88A36"/>
@@ -3052,7 +4391,7 @@
       </w:rPr>
     </w:lvl>
   </w:abstractNum>
-  <w:abstractNum w:abstractNumId="9" w15:restartNumberingAfterBreak="0">
+  <w:abstractNum w:abstractNumId="11" w15:restartNumberingAfterBreak="0">
     <w:nsid w:val="427379E4"/>
     <w:multiLevelType w:val="multilevel"/>
     <w:tmpl w:val="E90AAFA2"/>
@@ -3201,7 +4540,7 @@
       </w:rPr>
     </w:lvl>
   </w:abstractNum>
-  <w:abstractNum w:abstractNumId="10" w15:restartNumberingAfterBreak="0">
+  <w:abstractNum w:abstractNumId="12" w15:restartNumberingAfterBreak="0">
     <w:nsid w:val="48F051EB"/>
     <w:multiLevelType w:val="multilevel"/>
     <w:tmpl w:val="BCBC03B4"/>
@@ -3350,7 +4689,7 @@
       </w:rPr>
     </w:lvl>
   </w:abstractNum>
-  <w:abstractNum w:abstractNumId="11" w15:restartNumberingAfterBreak="0">
+  <w:abstractNum w:abstractNumId="13" w15:restartNumberingAfterBreak="0">
     <w:nsid w:val="49505814"/>
     <w:multiLevelType w:val="multilevel"/>
     <w:tmpl w:val="6C349B3C"/>
@@ -3499,7 +4838,7 @@
       </w:rPr>
     </w:lvl>
   </w:abstractNum>
-  <w:abstractNum w:abstractNumId="12" w15:restartNumberingAfterBreak="0">
+  <w:abstractNum w:abstractNumId="14" w15:restartNumberingAfterBreak="0">
     <w:nsid w:val="54894AD2"/>
     <w:multiLevelType w:val="multilevel"/>
     <w:tmpl w:val="498E1C10"/>
@@ -3648,7 +4987,7 @@
       </w:rPr>
     </w:lvl>
   </w:abstractNum>
-  <w:abstractNum w:abstractNumId="13" w15:restartNumberingAfterBreak="0">
+  <w:abstractNum w:abstractNumId="15" w15:restartNumberingAfterBreak="0">
     <w:nsid w:val="58A87A78"/>
     <w:multiLevelType w:val="multilevel"/>
     <w:tmpl w:val="26D401A0"/>
@@ -3797,7 +5136,7 @@
       </w:rPr>
     </w:lvl>
   </w:abstractNum>
-  <w:abstractNum w:abstractNumId="14" w15:restartNumberingAfterBreak="0">
+  <w:abstractNum w:abstractNumId="16" w15:restartNumberingAfterBreak="0">
     <w:nsid w:val="590F618B"/>
     <w:multiLevelType w:val="hybridMultilevel"/>
     <w:tmpl w:val="D1DA14E6"/>
@@ -3910,7 +5249,156 @@
       </w:rPr>
     </w:lvl>
   </w:abstractNum>
-  <w:abstractNum w:abstractNumId="15" w15:restartNumberingAfterBreak="0">
+  <w:abstractNum w:abstractNumId="17" w15:restartNumberingAfterBreak="0">
+    <w:nsid w:val="5A203F97"/>
+    <w:multiLevelType w:val="multilevel"/>
+    <w:tmpl w:val="82EE4FB2"/>
+    <w:lvl w:ilvl="0">
+      <w:start w:val="1"/>
+      <w:numFmt w:val="bullet"/>
+      <w:lvlText w:val=""/>
+      <w:lvlJc w:val="left"/>
+      <w:pPr>
+        <w:tabs>
+          <w:tab w:val="num" w:pos="720"/>
+        </w:tabs>
+        <w:ind w:left="720" w:hanging="360"/>
+      </w:pPr>
+      <w:rPr>
+        <w:rFonts w:ascii="Symbol" w:hAnsi="Symbol" w:hint="default"/>
+        <w:sz w:val="20"/>
+      </w:rPr>
+    </w:lvl>
+    <w:lvl w:ilvl="1" w:tentative="1">
+      <w:start w:val="1"/>
+      <w:numFmt w:val="bullet"/>
+      <w:lvlText w:val="o"/>
+      <w:lvlJc w:val="left"/>
+      <w:pPr>
+        <w:tabs>
+          <w:tab w:val="num" w:pos="1440"/>
+        </w:tabs>
+        <w:ind w:left="1440" w:hanging="360"/>
+      </w:pPr>
+      <w:rPr>
+        <w:rFonts w:ascii="Courier New" w:hAnsi="Courier New" w:hint="default"/>
+        <w:sz w:val="20"/>
+      </w:rPr>
+    </w:lvl>
+    <w:lvl w:ilvl="2" w:tentative="1">
+      <w:start w:val="1"/>
+      <w:numFmt w:val="bullet"/>
+      <w:lvlText w:val=""/>
+      <w:lvlJc w:val="left"/>
+      <w:pPr>
+        <w:tabs>
+          <w:tab w:val="num" w:pos="2160"/>
+        </w:tabs>
+        <w:ind w:left="2160" w:hanging="360"/>
+      </w:pPr>
+      <w:rPr>
+        <w:rFonts w:ascii="Wingdings" w:hAnsi="Wingdings" w:hint="default"/>
+        <w:sz w:val="20"/>
+      </w:rPr>
+    </w:lvl>
+    <w:lvl w:ilvl="3" w:tentative="1">
+      <w:start w:val="1"/>
+      <w:numFmt w:val="bullet"/>
+      <w:lvlText w:val=""/>
+      <w:lvlJc w:val="left"/>
+      <w:pPr>
+        <w:tabs>
+          <w:tab w:val="num" w:pos="2880"/>
+        </w:tabs>
+        <w:ind w:left="2880" w:hanging="360"/>
+      </w:pPr>
+      <w:rPr>
+        <w:rFonts w:ascii="Wingdings" w:hAnsi="Wingdings" w:hint="default"/>
+        <w:sz w:val="20"/>
+      </w:rPr>
+    </w:lvl>
+    <w:lvl w:ilvl="4" w:tentative="1">
+      <w:start w:val="1"/>
+      <w:numFmt w:val="bullet"/>
+      <w:lvlText w:val=""/>
+      <w:lvlJc w:val="left"/>
+      <w:pPr>
+        <w:tabs>
+          <w:tab w:val="num" w:pos="3600"/>
+        </w:tabs>
+        <w:ind w:left="3600" w:hanging="360"/>
+      </w:pPr>
+      <w:rPr>
+        <w:rFonts w:ascii="Wingdings" w:hAnsi="Wingdings" w:hint="default"/>
+        <w:sz w:val="20"/>
+      </w:rPr>
+    </w:lvl>
+    <w:lvl w:ilvl="5" w:tentative="1">
+      <w:start w:val="1"/>
+      <w:numFmt w:val="bullet"/>
+      <w:lvlText w:val=""/>
+      <w:lvlJc w:val="left"/>
+      <w:pPr>
+        <w:tabs>
+          <w:tab w:val="num" w:pos="4320"/>
+        </w:tabs>
+        <w:ind w:left="4320" w:hanging="360"/>
+      </w:pPr>
+      <w:rPr>
+        <w:rFonts w:ascii="Wingdings" w:hAnsi="Wingdings" w:hint="default"/>
+        <w:sz w:val="20"/>
+      </w:rPr>
+    </w:lvl>
+    <w:lvl w:ilvl="6" w:tentative="1">
+      <w:start w:val="1"/>
+      <w:numFmt w:val="bullet"/>
+      <w:lvlText w:val=""/>
+      <w:lvlJc w:val="left"/>
+      <w:pPr>
+        <w:tabs>
+          <w:tab w:val="num" w:pos="5040"/>
+        </w:tabs>
+        <w:ind w:left="5040" w:hanging="360"/>
+      </w:pPr>
+      <w:rPr>
+        <w:rFonts w:ascii="Wingdings" w:hAnsi="Wingdings" w:hint="default"/>
+        <w:sz w:val="20"/>
+      </w:rPr>
+    </w:lvl>
+    <w:lvl w:ilvl="7" w:tentative="1">
+      <w:start w:val="1"/>
+      <w:numFmt w:val="bullet"/>
+      <w:lvlText w:val=""/>
+      <w:lvlJc w:val="left"/>
+      <w:pPr>
+        <w:tabs>
+          <w:tab w:val="num" w:pos="5760"/>
+        </w:tabs>
+        <w:ind w:left="5760" w:hanging="360"/>
+      </w:pPr>
+      <w:rPr>
+        <w:rFonts w:ascii="Wingdings" w:hAnsi="Wingdings" w:hint="default"/>
+        <w:sz w:val="20"/>
+      </w:rPr>
+    </w:lvl>
+    <w:lvl w:ilvl="8" w:tentative="1">
+      <w:start w:val="1"/>
+      <w:numFmt w:val="bullet"/>
+      <w:lvlText w:val=""/>
+      <w:lvlJc w:val="left"/>
+      <w:pPr>
+        <w:tabs>
+          <w:tab w:val="num" w:pos="6480"/>
+        </w:tabs>
+        <w:ind w:left="6480" w:hanging="360"/>
+      </w:pPr>
+      <w:rPr>
+        <w:rFonts w:ascii="Wingdings" w:hAnsi="Wingdings" w:hint="default"/>
+        <w:sz w:val="20"/>
+      </w:rPr>
+    </w:lvl>
+  </w:abstractNum>
+  <w:abstractNum w:abstractNumId="18" w15:restartNumberingAfterBreak="0">
     <w:nsid w:val="5DDC128F"/>
     <w:multiLevelType w:val="multilevel"/>
     <w:tmpl w:val="68342448"/>
@@ -4059,7 +5547,7 @@
       </w:rPr>
     </w:lvl>
   </w:abstractNum>
-  <w:abstractNum w:abstractNumId="16" w15:restartNumberingAfterBreak="0">
+  <w:abstractNum w:abstractNumId="19" w15:restartNumberingAfterBreak="0">
     <w:nsid w:val="66E35936"/>
     <w:multiLevelType w:val="multilevel"/>
     <w:tmpl w:val="8D00C96A"/>
@@ -4208,7 +5696,156 @@
       </w:rPr>
     </w:lvl>
   </w:abstractNum>
-  <w:abstractNum w:abstractNumId="17" w15:restartNumberingAfterBreak="0">
+  <w:abstractNum w:abstractNumId="20" w15:restartNumberingAfterBreak="0">
+    <w:nsid w:val="6A5D2DA8"/>
+    <w:multiLevelType w:val="multilevel"/>
+    <w:tmpl w:val="97A4E7FA"/>
+    <w:lvl w:ilvl="0">
+      <w:start w:val="1"/>
+      <w:numFmt w:val="bullet"/>
+      <w:lvlText w:val=""/>
+      <w:lvlJc w:val="left"/>
+      <w:pPr>
+        <w:tabs>
+          <w:tab w:val="num" w:pos="720"/>
+        </w:tabs>
+        <w:ind w:left="720" w:hanging="360"/>
+      </w:pPr>
+      <w:rPr>
+        <w:rFonts w:ascii="Symbol" w:hAnsi="Symbol" w:hint="default"/>
+        <w:sz w:val="20"/>
+      </w:rPr>
+    </w:lvl>
+    <w:lvl w:ilvl="1">
+      <w:start w:val="1"/>
+      <w:numFmt w:val="bullet"/>
+      <w:lvlText w:val="o"/>
+      <w:lvlJc w:val="left"/>
+      <w:pPr>
+        <w:tabs>
+          <w:tab w:val="num" w:pos="1440"/>
+        </w:tabs>
+        <w:ind w:left="1440" w:hanging="360"/>
+      </w:pPr>
+      <w:rPr>
+        <w:rFonts w:ascii="Courier New" w:hAnsi="Courier New" w:hint="default"/>
+        <w:sz w:val="20"/>
+      </w:rPr>
+    </w:lvl>
+    <w:lvl w:ilvl="2" w:tentative="1">
+      <w:start w:val="1"/>
+      <w:numFmt w:val="bullet"/>
+      <w:lvlText w:val=""/>
+      <w:lvlJc w:val="left"/>
+      <w:pPr>
+        <w:tabs>
+          <w:tab w:val="num" w:pos="2160"/>
+        </w:tabs>
+        <w:ind w:left="2160" w:hanging="360"/>
+      </w:pPr>
+      <w:rPr>
+        <w:rFonts w:ascii="Wingdings" w:hAnsi="Wingdings" w:hint="default"/>
+        <w:sz w:val="20"/>
+      </w:rPr>
+    </w:lvl>
+    <w:lvl w:ilvl="3" w:tentative="1">
+      <w:start w:val="1"/>
+      <w:numFmt w:val="bullet"/>
+      <w:lvlText w:val=""/>
+      <w:lvlJc w:val="left"/>
+      <w:pPr>
+        <w:tabs>
+          <w:tab w:val="num" w:pos="2880"/>
+        </w:tabs>
+        <w:ind w:left="2880" w:hanging="360"/>
+      </w:pPr>
+      <w:rPr>
+        <w:rFonts w:ascii="Wingdings" w:hAnsi="Wingdings" w:hint="default"/>
+        <w:sz w:val="20"/>
+      </w:rPr>
+    </w:lvl>
+    <w:lvl w:ilvl="4" w:tentative="1">
+      <w:start w:val="1"/>
+      <w:numFmt w:val="bullet"/>
+      <w:lvlText w:val=""/>
+      <w:lvlJc w:val="left"/>
+      <w:pPr>
+        <w:tabs>
+          <w:tab w:val="num" w:pos="3600"/>
+        </w:tabs>
+        <w:ind w:left="3600" w:hanging="360"/>
+      </w:pPr>
+      <w:rPr>
+        <w:rFonts w:ascii="Wingdings" w:hAnsi="Wingdings" w:hint="default"/>
+        <w:sz w:val="20"/>
+      </w:rPr>
+    </w:lvl>
+    <w:lvl w:ilvl="5" w:tentative="1">
+      <w:start w:val="1"/>
+      <w:numFmt w:val="bullet"/>
+      <w:lvlText w:val=""/>
+      <w:lvlJc w:val="left"/>
+      <w:pPr>
+        <w:tabs>
+          <w:tab w:val="num" w:pos="4320"/>
+        </w:tabs>
+        <w:ind w:left="4320" w:hanging="360"/>
+      </w:pPr>
+      <w:rPr>
+        <w:rFonts w:ascii="Wingdings" w:hAnsi="Wingdings" w:hint="default"/>
+        <w:sz w:val="20"/>
+      </w:rPr>
+    </w:lvl>
+    <w:lvl w:ilvl="6" w:tentative="1">
+      <w:start w:val="1"/>
+      <w:numFmt w:val="bullet"/>
+      <w:lvlText w:val=""/>
+      <w:lvlJc w:val="left"/>
+      <w:pPr>
+        <w:tabs>
+          <w:tab w:val="num" w:pos="5040"/>
+        </w:tabs>
+        <w:ind w:left="5040" w:hanging="360"/>
+      </w:pPr>
+      <w:rPr>
+        <w:rFonts w:ascii="Wingdings" w:hAnsi="Wingdings" w:hint="default"/>
+        <w:sz w:val="20"/>
+      </w:rPr>
+    </w:lvl>
+    <w:lvl w:ilvl="7" w:tentative="1">
+      <w:start w:val="1"/>
+      <w:numFmt w:val="bullet"/>
+      <w:lvlText w:val=""/>
+      <w:lvlJc w:val="left"/>
+      <w:pPr>
+        <w:tabs>
+          <w:tab w:val="num" w:pos="5760"/>
+        </w:tabs>
+        <w:ind w:left="5760" w:hanging="360"/>
+      </w:pPr>
+      <w:rPr>
+        <w:rFonts w:ascii="Wingdings" w:hAnsi="Wingdings" w:hint="default"/>
+        <w:sz w:val="20"/>
+      </w:rPr>
+    </w:lvl>
+    <w:lvl w:ilvl="8" w:tentative="1">
+      <w:start w:val="1"/>
+      <w:numFmt w:val="bullet"/>
+      <w:lvlText w:val=""/>
+      <w:lvlJc w:val="left"/>
+      <w:pPr>
+        <w:tabs>
+          <w:tab w:val="num" w:pos="6480"/>
+        </w:tabs>
+        <w:ind w:left="6480" w:hanging="360"/>
+      </w:pPr>
+      <w:rPr>
+        <w:rFonts w:ascii="Wingdings" w:hAnsi="Wingdings" w:hint="default"/>
+        <w:sz w:val="20"/>
+      </w:rPr>
+    </w:lvl>
+  </w:abstractNum>
+  <w:abstractNum w:abstractNumId="21" w15:restartNumberingAfterBreak="0">
     <w:nsid w:val="75C67F93"/>
     <w:multiLevelType w:val="multilevel"/>
     <w:tmpl w:val="0E320734"/>
@@ -4357,7 +5994,7 @@
       </w:rPr>
     </w:lvl>
   </w:abstractNum>
-  <w:abstractNum w:abstractNumId="18" w15:restartNumberingAfterBreak="0">
+  <w:abstractNum w:abstractNumId="22" w15:restartNumberingAfterBreak="0">
     <w:nsid w:val="7A294371"/>
     <w:multiLevelType w:val="multilevel"/>
     <w:tmpl w:val="F80EFC08"/>
@@ -4506,7 +6143,7 @@
       </w:rPr>
     </w:lvl>
   </w:abstractNum>
-  <w:abstractNum w:abstractNumId="19" w15:restartNumberingAfterBreak="0">
+  <w:abstractNum w:abstractNumId="23" w15:restartNumberingAfterBreak="0">
     <w:nsid w:val="7B8033E9"/>
     <w:multiLevelType w:val="multilevel"/>
     <w:tmpl w:val="55E00A7E"/>
@@ -4656,64 +6293,76 @@
     </w:lvl>
   </w:abstractNum>
   <w:num w:numId="1" w16cid:durableId="1846239967">
-    <w:abstractNumId w:val="5"/>
+    <w:abstractNumId w:val="6"/>
   </w:num>
   <w:num w:numId="2" w16cid:durableId="382409207">
-    <w:abstractNumId w:val="7"/>
+    <w:abstractNumId w:val="9"/>
   </w:num>
   <w:num w:numId="3" w16cid:durableId="822350782">
-    <w:abstractNumId w:val="10"/>
+    <w:abstractNumId w:val="12"/>
   </w:num>
   <w:num w:numId="4" w16cid:durableId="139658719">
     <w:abstractNumId w:val="1"/>
   </w:num>
   <w:num w:numId="5" w16cid:durableId="1747655212">
-    <w:abstractNumId w:val="17"/>
+    <w:abstractNumId w:val="21"/>
   </w:num>
   <w:num w:numId="6" w16cid:durableId="964694399">
-    <w:abstractNumId w:val="9"/>
+    <w:abstractNumId w:val="11"/>
   </w:num>
   <w:num w:numId="7" w16cid:durableId="1179270183">
-    <w:abstractNumId w:val="16"/>
+    <w:abstractNumId w:val="19"/>
   </w:num>
   <w:num w:numId="8" w16cid:durableId="1873151275">
-    <w:abstractNumId w:val="12"/>
+    <w:abstractNumId w:val="14"/>
   </w:num>
   <w:num w:numId="9" w16cid:durableId="859465524">
-    <w:abstractNumId w:val="18"/>
+    <w:abstractNumId w:val="22"/>
   </w:num>
   <w:num w:numId="10" w16cid:durableId="1973824263">
     <w:abstractNumId w:val="2"/>
   </w:num>
   <w:num w:numId="11" w16cid:durableId="1882328486">
-    <w:abstractNumId w:val="19"/>
+    <w:abstractNumId w:val="23"/>
   </w:num>
   <w:num w:numId="12" w16cid:durableId="636420743">
-    <w:abstractNumId w:val="15"/>
+    <w:abstractNumId w:val="18"/>
   </w:num>
   <w:num w:numId="13" w16cid:durableId="1794908417">
     <w:abstractNumId w:val="3"/>
   </w:num>
   <w:num w:numId="14" w16cid:durableId="1677031717">
-    <w:abstractNumId w:val="11"/>
+    <w:abstractNumId w:val="13"/>
   </w:num>
   <w:num w:numId="15" w16cid:durableId="1564758533">
-    <w:abstractNumId w:val="8"/>
+    <w:abstractNumId w:val="10"/>
   </w:num>
   <w:num w:numId="16" w16cid:durableId="1535077787">
-    <w:abstractNumId w:val="13"/>
+    <w:abstractNumId w:val="15"/>
   </w:num>
   <w:num w:numId="17" w16cid:durableId="708339773">
-    <w:abstractNumId w:val="4"/>
+    <w:abstractNumId w:val="5"/>
   </w:num>
   <w:num w:numId="18" w16cid:durableId="395710886">
-    <w:abstractNumId w:val="6"/>
+    <w:abstractNumId w:val="8"/>
   </w:num>
   <w:num w:numId="19" w16cid:durableId="154031667">
     <w:abstractNumId w:val="0"/>
   </w:num>
   <w:num w:numId="20" w16cid:durableId="1209756734">
-    <w:abstractNumId w:val="14"/>
+    <w:abstractNumId w:val="16"/>
+  </w:num>
+  <w:num w:numId="21" w16cid:durableId="2004048207">
+    <w:abstractNumId w:val="17"/>
+  </w:num>
+  <w:num w:numId="22" w16cid:durableId="647825977">
+    <w:abstractNumId w:val="4"/>
+  </w:num>
+  <w:num w:numId="23" w16cid:durableId="2041935465">
+    <w:abstractNumId w:val="7"/>
+  </w:num>
+  <w:num w:numId="24" w16cid:durableId="162478770">
+    <w:abstractNumId w:val="20"/>
   </w:num>
 </w:numbering>
 </file>
@@ -5643,6 +7292,18 @@
       <w:spacing w:after="0" w:line="240" w:lineRule="auto"/>
     </w:pPr>
   </w:style>
+  <w:style w:type="paragraph" w:styleId="NormalWeb">
+    <w:name w:val="Normal (Web)"/>
+    <w:basedOn w:val="Normal"/>
+    <w:uiPriority w:val="99"/>
+    <w:semiHidden/>
+    <w:unhideWhenUsed/>
+    <w:rsid w:val="00C97A0E"/>
+    <w:rPr>
+      <w:rFonts w:cs="Times New Roman"/>
+      <w:sz w:val="24"/>
+    </w:rPr>
+  </w:style>
 </w:styles>
 </file>
 

</xml_diff>